<commit_message>
LETGO SIDANG, revisi tulisan cok
revisi tulisan lagi (semoga)
</commit_message>
<xml_diff>
--- a/docs/diagram/word/Bab4-RancanganAntarmuka.docx
+++ b/docs/diagram/word/Bab4-RancanganAntarmuka.docx
@@ -779,7 +779,7 @@
         <w:rPr>
           <w:rStyle w:val="VerbatimChar"/>
         </w:rPr>
-        <w:t xml:space="preserve">| [=] SIKAMI      [ Pencarian global............ ]   [tema] [lonceng] [akun] |  &lt;- Header</w:t>
+        <w:t xml:space="preserve">| [=] SIKAMI   Senin, 28 Sep 2026 . 08.15   [ Cari... Ctrl+K ] [lonceng][akun] |</w:t>
       </w:r>
       <w:r>
         <w:br/>
@@ -860,7 +860,25 @@
         <w:rPr>
           <w:rStyle w:val="VerbatimChar"/>
         </w:rPr>
-        <w:t xml:space="preserve">| [+ Input Kegiatan ]                                                        |</w:t>
+        <w:t xml:space="preserve">| [+ Kegiatan Baru ]                                                         |</w:t>
+      </w:r>
+      <w:r>
+        <w:br/>
+      </w:r>
+      <w:r>
+        <w:rPr>
+          <w:rStyle w:val="VerbatimChar"/>
+        </w:rPr>
+        <w:t xml:space="preserve">| [ Mode Gelap ]                                                             |</w:t>
+      </w:r>
+      <w:r>
+        <w:br/>
+      </w:r>
+      <w:r>
+        <w:rPr>
+          <w:rStyle w:val="VerbatimChar"/>
+        </w:rPr>
+        <w:t xml:space="preserve">| [ Logout ]                                                                 |</w:t>
       </w:r>
       <w:r>
         <w:br/>
@@ -941,7 +959,7 @@
         <w:t xml:space="preserve"> </w:t>
       </w:r>
       <w:r>
-        <w:t xml:space="preserve">agar area isi lebih lega. Di bagian bawah terdapat tombol</w:t>
+        <w:t xml:space="preserve">agar area isi lebih lega. Di bagian bawahnya berturut-turut terdapat tombol</w:t>
       </w:r>
       <w:r>
         <w:t xml:space="preserve"> </w:t>
@@ -951,19 +969,32 @@
           <w:b/>
           <w:bCs/>
         </w:rPr>
-        <w:t xml:space="preserve">Input Kegiatan</w:t>
-      </w:r>
-      <w:r>
-        <w:t xml:space="preserve"> </w:t>
-      </w:r>
-      <w:r>
-        <w:t xml:space="preserve">yang sengaja dibedakan warnanya karena merupakan aksi yang paling sering</w:t>
-      </w:r>
-      <w:r>
-        <w:t xml:space="preserve"> </w:t>
-      </w:r>
-      <w:r>
-        <w:t xml:space="preserve">dipakai.</w:t>
+        <w:t xml:space="preserve">Kegiatan Baru</w:t>
+      </w:r>
+      <w:r>
+        <w:t xml:space="preserve"> </w:t>
+      </w:r>
+      <w:r>
+        <w:t xml:space="preserve">yang sengaja dibedakan warnanya karena merupakan aksi yang</w:t>
+      </w:r>
+      <w:r>
+        <w:t xml:space="preserve"> </w:t>
+      </w:r>
+      <w:r>
+        <w:t xml:space="preserve">paling sering dipakai, penukar tema terang dan gelap, lalu tombol</w:t>
+      </w:r>
+      <w:r>
+        <w:t xml:space="preserve"> </w:t>
+      </w:r>
+      <w:r>
+        <w:rPr>
+          <w:b/>
+          <w:bCs/>
+        </w:rPr>
+        <w:t xml:space="preserve">Logout</w:t>
+      </w:r>
+      <w:r>
+        <w:t xml:space="preserve">.</w:t>
       </w:r>
     </w:p>
     <w:p>
@@ -985,19 +1016,25 @@
         <w:t xml:space="preserve"> </w:t>
       </w:r>
       <w:r>
-        <w:t xml:space="preserve">Memuat kotak pencarian global, penukar tema terang dan</w:t>
-      </w:r>
-      <w:r>
-        <w:t xml:space="preserve"> </w:t>
-      </w:r>
-      <w:r>
-        <w:t xml:space="preserve">gelap, lonceng notifikasi beserta jumlah notifikasi yang belum dibaca, dan menu</w:t>
-      </w:r>
-      <w:r>
-        <w:t xml:space="preserve"> </w:t>
-      </w:r>
-      <w:r>
-        <w:t xml:space="preserve">akun berisi tautan Profil dan Keluar.</w:t>
+        <w:t xml:space="preserve">Memuat judul halaman yang sedang dibuka, penunjuk</w:t>
+      </w:r>
+      <w:r>
+        <w:t xml:space="preserve"> </w:t>
+      </w:r>
+      <w:r>
+        <w:t xml:space="preserve">tanggal dan jam yang berjalan, kotak pencarian global yang juga dapat dibuka</w:t>
+      </w:r>
+      <w:r>
+        <w:t xml:space="preserve"> </w:t>
+      </w:r>
+      <w:r>
+        <w:t xml:space="preserve">dengan Ctrl+K, lonceng notifikasi beserta jumlah notifikasi yang belum dibaca,</w:t>
+      </w:r>
+      <w:r>
+        <w:t xml:space="preserve"> </w:t>
+      </w:r>
+      <w:r>
+        <w:t xml:space="preserve">dan tautan ke halaman Profil.</w:t>
       </w:r>
     </w:p>
     <w:p>
@@ -1242,25 +1279,34 @@
         <w:rPr>
           <w:rStyle w:val="VerbatimChar"/>
         </w:rPr>
-        <w:t xml:space="preserve">|        Kharisma.             |   Masuk ke Sistem             |</w:t>
-      </w:r>
-      <w:r>
-        <w:br/>
-      </w:r>
-      <w:r>
-        <w:rPr>
-          <w:rStyle w:val="VerbatimChar"/>
-        </w:rPr>
-        <w:t xml:space="preserve">|   Sistem administrasi dan    |   Username [................] |</w:t>
-      </w:r>
-      <w:r>
-        <w:br/>
-      </w:r>
-      <w:r>
-        <w:rPr>
-          <w:rStyle w:val="VerbatimChar"/>
-        </w:rPr>
-        <w:t xml:space="preserve">|   pemantauan mitra statistik |   Password [..........] [mata]|</w:t>
+        <w:t xml:space="preserve">|          SIKAMI              |   Masuk ke Sistem             |</w:t>
+      </w:r>
+      <w:r>
+        <w:br/>
+      </w:r>
+      <w:r>
+        <w:rPr>
+          <w:rStyle w:val="VerbatimChar"/>
+        </w:rPr>
+        <w:t xml:space="preserve">|  Sistem Informasi Administrasi|   Username [................] |</w:t>
+      </w:r>
+      <w:r>
+        <w:br/>
+      </w:r>
+      <w:r>
+        <w:rPr>
+          <w:rStyle w:val="VerbatimChar"/>
+        </w:rPr>
+        <w:t xml:space="preserve">|  dan Pemantauan Kegiatan     |   Password [..........] [mata]|</w:t>
+      </w:r>
+      <w:r>
+        <w:br/>
+      </w:r>
+      <w:r>
+        <w:rPr>
+          <w:rStyle w:val="VerbatimChar"/>
+        </w:rPr>
+        <w:t xml:space="preserve">|  Mitra Statistik             |                               |</w:t>
       </w:r>
       <w:r>
         <w:br/>
@@ -1755,6 +1801,71 @@
         <w:pStyle w:val="BodyText"/>
       </w:pPr>
       <w:r>
+        <w:t xml:space="preserve">Panel ini juga dirancang</w:t>
+      </w:r>
+      <w:r>
+        <w:t xml:space="preserve"> </w:t>
+      </w:r>
+      <w:r>
+        <w:rPr>
+          <w:b/>
+          <w:bCs/>
+        </w:rPr>
+        <w:t xml:space="preserve">terkunci selama kegiatan masih berada pada tahap</w:t>
+      </w:r>
+      <w:r>
+        <w:rPr>
+          <w:b/>
+          <w:bCs/>
+        </w:rPr>
+        <w:t xml:space="preserve"> </w:t>
+      </w:r>
+      <w:r>
+        <w:rPr>
+          <w:b/>
+          <w:bCs/>
+        </w:rPr>
+        <w:t xml:space="preserve">Persiapan</w:t>
+      </w:r>
+      <w:r>
+        <w:t xml:space="preserve">, dan baru terbuka sejak hari pertama masa pengumpulan data. Alasannya,</w:t>
+      </w:r>
+      <w:r>
+        <w:t xml:space="preserve"> </w:t>
+      </w:r>
+      <w:r>
+        <w:t xml:space="preserve">pada tahap persiapan mitra belum bekerja sehingga angka apa pun yang masuk pasti</w:t>
+      </w:r>
+      <w:r>
+        <w:t xml:space="preserve"> </w:t>
+      </w:r>
+      <w:r>
+        <w:t xml:space="preserve">keliru, dan angka keliru itu langsung terbawa ke persentase kegiatan, dasbor, dan</w:t>
+      </w:r>
+      <w:r>
+        <w:t xml:space="preserve"> </w:t>
+      </w:r>
+      <w:r>
+        <w:t xml:space="preserve">rekapitulasi. Sesudah masa pengumpulan data berakhir, panel tidak ditutup kembali,</w:t>
+      </w:r>
+      <w:r>
+        <w:t xml:space="preserve"> </w:t>
+      </w:r>
+      <w:r>
+        <w:t xml:space="preserve">karena pendataan kerap berlangsung melewati jadwal dan pekerjaan yang benar-benar</w:t>
+      </w:r>
+      <w:r>
+        <w:t xml:space="preserve"> </w:t>
+      </w:r>
+      <w:r>
+        <w:t xml:space="preserve">terjadi tetap perlu dapat dicatat.</w:t>
+      </w:r>
+    </w:p>
+    <w:p>
+      <w:pPr>
+        <w:pStyle w:val="BodyText"/>
+      </w:pPr>
+      <w:r>
         <w:t xml:space="preserve">Lapis keempat adalah delapan grafik ringkasan: sebaran kegiatan per status, jumlah</w:t>
       </w:r>
       <w:r>
@@ -4954,88 +5065,115 @@
         <w:rPr>
           <w:rStyle w:val="VerbatimChar"/>
         </w:rPr>
-        <w:t xml:space="preserve">        +-------------------------------------------------------+</w:t>
-      </w:r>
-      <w:r>
-        <w:br/>
-      </w:r>
-      <w:r>
-        <w:rPr>
-          <w:rStyle w:val="VerbatimChar"/>
-        </w:rPr>
-        <w:t xml:space="preserve">        |  Impor Mitra dari Excel SOBAT                         |</w:t>
-      </w:r>
-      <w:r>
-        <w:br/>
-      </w:r>
-      <w:r>
-        <w:rPr>
-          <w:rStyle w:val="VerbatimChar"/>
-        </w:rPr>
-        <w:t xml:space="preserve">        |  Berkas Excel (.xlsx) [ pilih berkas ]                |</w:t>
-      </w:r>
-      <w:r>
-        <w:br/>
-      </w:r>
-      <w:r>
-        <w:rPr>
-          <w:rStyle w:val="VerbatimChar"/>
-        </w:rPr>
-        <w:t xml:space="preserve">        |  Baris judul kolom: [ 3 v ]                           |</w:t>
-      </w:r>
-      <w:r>
-        <w:br/>
-      </w:r>
-      <w:r>
-        <w:rPr>
-          <w:rStyle w:val="VerbatimChar"/>
-        </w:rPr>
-        <w:t xml:space="preserve">        |  Pemetaan kolom: Nama [B v] ID SOBAT [A v] ...        |</w:t>
-      </w:r>
-      <w:r>
-        <w:br/>
-      </w:r>
-      <w:r>
-        <w:rPr>
-          <w:rStyle w:val="VerbatimChar"/>
-        </w:rPr>
-        <w:t xml:space="preserve">        |  ------------------ Pratinjau -----------------       |</w:t>
-      </w:r>
-      <w:r>
-        <w:br/>
-      </w:r>
-      <w:r>
-        <w:rPr>
-          <w:rStyle w:val="VerbatimChar"/>
-        </w:rPr>
-        <w:t xml:space="preserve">        |  Tambah 12 | Perbarui 30 | Lewati 4 | Nonaktifkan 2   |</w:t>
-      </w:r>
-      <w:r>
-        <w:br/>
-      </w:r>
-      <w:r>
-        <w:rPr>
-          <w:rStyle w:val="VerbatimChar"/>
-        </w:rPr>
-        <w:t xml:space="preserve">        |  Budi S. (ID 1234)   -&gt; [ tambah / perbarui / lewati ]|</w:t>
-      </w:r>
-      <w:r>
-        <w:br/>
-      </w:r>
-      <w:r>
-        <w:rPr>
-          <w:rStyle w:val="VerbatimChar"/>
-        </w:rPr>
-        <w:t xml:space="preserve">        |                      [ Batal ]  [ Terapkan Impor ]    |</w:t>
-      </w:r>
-      <w:r>
-        <w:br/>
-      </w:r>
-      <w:r>
-        <w:rPr>
-          <w:rStyle w:val="VerbatimChar"/>
-        </w:rPr>
-        <w:t xml:space="preserve">        +-------------------------------------------------------+</w:t>
+        <w:t xml:space="preserve">        +----------------------------------------------------------+</w:t>
+      </w:r>
+      <w:r>
+        <w:br/>
+      </w:r>
+      <w:r>
+        <w:rPr>
+          <w:rStyle w:val="VerbatimChar"/>
+        </w:rPr>
+        <w:t xml:space="preserve">        |  Impor Mitra dari Berkas Excel                           |</w:t>
+      </w:r>
+      <w:r>
+        <w:br/>
+      </w:r>
+      <w:r>
+        <w:rPr>
+          <w:rStyle w:val="VerbatimChar"/>
+        </w:rPr>
+        <w:t xml:space="preserve">        |  (1) Pilih Berkas  (2) Petakan  [3] Tinjau  (4) Nonaktif |</w:t>
+      </w:r>
+      <w:r>
+        <w:br/>
+      </w:r>
+      <w:r>
+        <w:rPr>
+          <w:rStyle w:val="VerbatimChar"/>
+        </w:rPr>
+        <w:t xml:space="preserve">        |  ------------------------------------------------------- |</w:t>
+      </w:r>
+      <w:r>
+        <w:br/>
+      </w:r>
+      <w:r>
+        <w:rPr>
+          <w:rStyle w:val="VerbatimChar"/>
+        </w:rPr>
+        <w:t xml:space="preserve">        |  12 baru | 30 cocok | 4 perlu dipastikan | 2 bermasalah  |</w:t>
+      </w:r>
+      <w:r>
+        <w:br/>
+      </w:r>
+      <w:r>
+        <w:rPr>
+          <w:rStyle w:val="VerbatimChar"/>
+        </w:rPr>
+        <w:t xml:space="preserve">        |  Baris | Nama         | ID SOBAT | Status     | Tindakan |</w:t>
+      </w:r>
+      <w:r>
+        <w:br/>
+      </w:r>
+      <w:r>
+        <w:rPr>
+          <w:rStyle w:val="VerbatimChar"/>
+        </w:rPr>
+        <w:t xml:space="preserve">        |   4    | Ahmad Fauzi  | 1290     | Baru       | tambah v |</w:t>
+      </w:r>
+      <w:r>
+        <w:br/>
+      </w:r>
+      <w:r>
+        <w:rPr>
+          <w:rStyle w:val="VerbatimChar"/>
+        </w:rPr>
+        <w:t xml:space="preserve">        |   5    | Budi Santoso | 1234     | Cocok      | perbarui |</w:t>
+      </w:r>
+      <w:r>
+        <w:br/>
+      </w:r>
+      <w:r>
+        <w:rPr>
+          <w:rStyle w:val="VerbatimChar"/>
+        </w:rPr>
+        <w:t xml:space="preserve">        |   6    | Siti Aminah  |   -      | Perlu      | lewati v |</w:t>
+      </w:r>
+      <w:r>
+        <w:br/>
+      </w:r>
+      <w:r>
+        <w:rPr>
+          <w:rStyle w:val="VerbatimChar"/>
+        </w:rPr>
+        <w:t xml:space="preserve">        |        |              |          | dipastikan |          |</w:t>
+      </w:r>
+      <w:r>
+        <w:br/>
+      </w:r>
+      <w:r>
+        <w:rPr>
+          <w:rStyle w:val="VerbatimChar"/>
+        </w:rPr>
+        <w:t xml:space="preserve">        |   7    | Rudi Hartono | 1236     | Ganda      | terkunci |</w:t>
+      </w:r>
+      <w:r>
+        <w:br/>
+      </w:r>
+      <w:r>
+        <w:rPr>
+          <w:rStyle w:val="VerbatimChar"/>
+        </w:rPr>
+        <w:t xml:space="preserve">        |                        [ Batal ]  [ Terapkan Impor ]     |</w:t>
+      </w:r>
+      <w:r>
+        <w:br/>
+      </w:r>
+      <w:r>
+        <w:rPr>
+          <w:rStyle w:val="VerbatimChar"/>
+        </w:rPr>
+        <w:t xml:space="preserve">        +----------------------------------------------------------+</w:t>
       </w:r>
     </w:p>
     <w:p>
@@ -5079,34 +5217,167 @@
           <w:b/>
           <w:bCs/>
         </w:rPr>
-        <w:t xml:space="preserve">Impor Mitra dari Excel SOBAT</w:t>
-      </w:r>
-      <w:r>
-        <w:t xml:space="preserve">.</w:t>
-      </w:r>
-      <w:r>
-        <w:t xml:space="preserve"> </w:t>
-      </w:r>
-      <w:r>
-        <w:t xml:space="preserve">Rancangannya dibuat bertahap: memilih berkas, menentukan baris judul kolom dan</w:t>
-      </w:r>
-      <w:r>
-        <w:t xml:space="preserve"> </w:t>
-      </w:r>
-      <w:r>
-        <w:t xml:space="preserve">pemetaan kolom, lalu menampilkan pratinjau berisi ringkasan jumlah baris yang akan</w:t>
-      </w:r>
-      <w:r>
-        <w:t xml:space="preserve"> </w:t>
-      </w:r>
-      <w:r>
-        <w:t xml:space="preserve">ditambah, diperbarui, dilewati, dan dinonaktifkan. Admin dapat mengubah tindakan</w:t>
-      </w:r>
-      <w:r>
-        <w:t xml:space="preserve"> </w:t>
-      </w:r>
-      <w:r>
-        <w:t xml:space="preserve">setiap baris sebelum impor dijalankan.</w:t>
+        <w:t xml:space="preserve">Impor Mitra dari Berkas</w:t>
+      </w:r>
+      <w:r>
+        <w:rPr>
+          <w:b/>
+          <w:bCs/>
+        </w:rPr>
+        <w:t xml:space="preserve"> </w:t>
+      </w:r>
+      <w:r>
+        <w:rPr>
+          <w:b/>
+          <w:bCs/>
+        </w:rPr>
+        <w:t xml:space="preserve">Excel</w:t>
+      </w:r>
+      <w:r>
+        <w:t xml:space="preserve">. Rancangannya berupa runtutan empat langkah, bukan satu layar: memilih</w:t>
+      </w:r>
+      <w:r>
+        <w:t xml:space="preserve"> </w:t>
+      </w:r>
+      <w:r>
+        <w:t xml:space="preserve">berkas, memetakan kolom, meninjau, lalu menentukan mitra yang dinonaktifkan.</w:t>
+      </w:r>
+    </w:p>
+    <w:p>
+      <w:pPr>
+        <w:pStyle w:val="BodyText"/>
+      </w:pPr>
+      <w:r>
+        <w:t xml:space="preserve">Langkah memetakan kolom</w:t>
+      </w:r>
+      <w:r>
+        <w:t xml:space="preserve"> </w:t>
+      </w:r>
+      <w:r>
+        <w:rPr>
+          <w:b/>
+          <w:bCs/>
+        </w:rPr>
+        <w:t xml:space="preserve">hanya muncul bila judul kolom pada berkas tidak</w:t>
+      </w:r>
+      <w:r>
+        <w:rPr>
+          <w:b/>
+          <w:bCs/>
+        </w:rPr>
+        <w:t xml:space="preserve"> </w:t>
+      </w:r>
+      <w:r>
+        <w:rPr>
+          <w:b/>
+          <w:bCs/>
+        </w:rPr>
+        <w:t xml:space="preserve">dikenali</w:t>
+      </w:r>
+      <w:r>
+        <w:t xml:space="preserve">. Pada keadaan biasa langkah itu dilewati, karena kolom dicocokkan</w:t>
+      </w:r>
+      <w:r>
+        <w:t xml:space="preserve"> </w:t>
+      </w:r>
+      <w:r>
+        <w:t xml:space="preserve">menurut nama judulnya, bukan urutannya, sehingga berkas boleh memiliki kolom</w:t>
+      </w:r>
+      <w:r>
+        <w:t xml:space="preserve"> </w:t>
+      </w:r>
+      <w:r>
+        <w:t xml:space="preserve">tambahan maupun urutan yang berbeda. Pada langkah pertama juga tersedia unduhan</w:t>
+      </w:r>
+      <w:r>
+        <w:t xml:space="preserve"> </w:t>
+      </w:r>
+      <w:r>
+        <w:t xml:space="preserve">templat Excel sebagai acuan bentuk berkas.</w:t>
+      </w:r>
+    </w:p>
+    <w:p>
+      <w:pPr>
+        <w:pStyle w:val="BodyText"/>
+      </w:pPr>
+      <w:r>
+        <w:t xml:space="preserve">Langkah meninjau menampilkan ringkasan jumlah baris menurut keadaannya — baru,</w:t>
+      </w:r>
+      <w:r>
+        <w:t xml:space="preserve"> </w:t>
+      </w:r>
+      <w:r>
+        <w:t xml:space="preserve">cocok, perlu dipastikan, dan bermasalah — beserta tabel rinci tiap baris. Baris</w:t>
+      </w:r>
+      <w:r>
+        <w:t xml:space="preserve"> </w:t>
+      </w:r>
+      <w:r>
+        <w:t xml:space="preserve">bertanda "perlu dipastikan" adalah baris yang hanya cocok namanya tanpa ID SOBAT;</w:t>
+      </w:r>
+      <w:r>
+        <w:t xml:space="preserve"> </w:t>
+      </w:r>
+      <w:r>
+        <w:t xml:space="preserve">bawaannya dilewati dan hanya diubah menjadi perbarui bila Admin yakin itu orang</w:t>
+      </w:r>
+      <w:r>
+        <w:t xml:space="preserve"> </w:t>
+      </w:r>
+      <w:r>
+        <w:t xml:space="preserve">yang sama. Baris yang ganda di dalam berkas atau tidak sah dikunci pada tindakan</w:t>
+      </w:r>
+      <w:r>
+        <w:t xml:space="preserve"> </w:t>
+      </w:r>
+      <w:r>
+        <w:t xml:space="preserve">lewati sehingga tidak dapat ikut tersimpan.</w:t>
+      </w:r>
+    </w:p>
+    <w:p>
+      <w:pPr>
+        <w:pStyle w:val="BodyText"/>
+      </w:pPr>
+      <w:r>
+        <w:t xml:space="preserve">Wilayah mitra pada berkas ekspor yang dipakai satuan kerja dituliskan sebagai kode</w:t>
+      </w:r>
+      <w:r>
+        <w:t xml:space="preserve"> </w:t>
+      </w:r>
+      <w:r>
+        <w:t xml:space="preserve">BPS, bukan nama. Karena itu sistem menyimpan kode kecamatan dan desa pada basis</w:t>
+      </w:r>
+      <w:r>
+        <w:t xml:space="preserve"> </w:t>
+      </w:r>
+      <w:r>
+        <w:t xml:space="preserve">datanya sendiri, lalu memakai kode tersebut untuk mencocokkan wilayah tiap baris</w:t>
+      </w:r>
+      <w:r>
+        <w:t xml:space="preserve"> </w:t>
+      </w:r>
+      <w:r>
+        <w:t xml:space="preserve">tanpa perlu diisikan Admin.</w:t>
+      </w:r>
+    </w:p>
+    <w:p>
+      <w:pPr>
+        <w:pStyle w:val="BodyText"/>
+      </w:pPr>
+      <w:r>
+        <w:t xml:space="preserve">Langkah terakhir menampilkan mitra yang terdaftar di sistem tetapi tidak ada di</w:t>
+      </w:r>
+      <w:r>
+        <w:t xml:space="preserve"> </w:t>
+      </w:r>
+      <w:r>
+        <w:t xml:space="preserve">dalam berkas, masing-masing dengan kotak centang, agar Admin memilih sendiri mana</w:t>
+      </w:r>
+      <w:r>
+        <w:t xml:space="preserve"> </w:t>
+      </w:r>
+      <w:r>
+        <w:t xml:space="preserve">yang memang sudah tidak menjadi mitra.</w:t>
       </w:r>
     </w:p>
     <w:p>
@@ -5196,43 +5467,79 @@
         <w:rPr>
           <w:rStyle w:val="VerbatimChar"/>
         </w:rPr>
-        <w:t xml:space="preserve">| Identitas Akun                |     | Notifikasi                      (5)  |</w:t>
-      </w:r>
-      <w:r>
-        <w:br/>
-      </w:r>
-      <w:r>
-        <w:rPr>
-          <w:rStyle w:val="VerbatimChar"/>
-        </w:rPr>
-        <w:t xml:space="preserve">|  Username     : andi          |     | [!] Dokumen ditolak: KAK Susenas     |</w:t>
-      </w:r>
-      <w:r>
-        <w:br/>
-      </w:r>
-      <w:r>
-        <w:rPr>
-          <w:rStyle w:val="VerbatimChar"/>
-        </w:rPr>
-        <w:t xml:space="preserve">|  Nama Lengkap : Andi Saputra  |     | [!] Tenggat Pencacahan H-2           |</w:t>
-      </w:r>
-      <w:r>
-        <w:br/>
-      </w:r>
-      <w:r>
-        <w:rPr>
-          <w:rStyle w:val="VerbatimChar"/>
-        </w:rPr>
-        <w:t xml:space="preserve">|  Peran        : PML           |     | [i] Progres belum diperbarui 3 hari  |</w:t>
-      </w:r>
-      <w:r>
-        <w:br/>
-      </w:r>
-      <w:r>
-        <w:rPr>
-          <w:rStyle w:val="VerbatimChar"/>
-        </w:rPr>
-        <w:t xml:space="preserve">|  (hanya dapat dibaca)         |     | [i] 4 dokumen menunggu persetujuan   |</w:t>
+        <w:t xml:space="preserve">| Identitas Akun                |     | Notifikasi                      (6)  |</w:t>
+      </w:r>
+      <w:r>
+        <w:br/>
+      </w:r>
+      <w:r>
+        <w:rPr>
+          <w:rStyle w:val="VerbatimChar"/>
+        </w:rPr>
+        <w:t xml:space="preserve">|  Username     : andi          |     | -- Perlu diperbaiki --               |</w:t>
+      </w:r>
+      <w:r>
+        <w:br/>
+      </w:r>
+      <w:r>
+        <w:rPr>
+          <w:rStyle w:val="VerbatimChar"/>
+        </w:rPr>
+        <w:t xml:space="preserve">|  Nama Lengkap : Andi Saputra  |     | [!] Dokumen ditolak: KAK Susenas     |</w:t>
+      </w:r>
+      <w:r>
+        <w:br/>
+      </w:r>
+      <w:r>
+        <w:rPr>
+          <w:rStyle w:val="VerbatimChar"/>
+        </w:rPr>
+        <w:t xml:space="preserve">|  Peran        : PML           |     | [!] Isi surat berubah setelah terbit |</w:t>
+      </w:r>
+      <w:r>
+        <w:br/>
+      </w:r>
+      <w:r>
+        <w:rPr>
+          <w:rStyle w:val="VerbatimChar"/>
+        </w:rPr>
+        <w:t xml:space="preserve">|  (hanya dapat dibaca)         |     | -- Tenggat mendekat --               |</w:t>
+      </w:r>
+      <w:r>
+        <w:br/>
+      </w:r>
+      <w:r>
+        <w:rPr>
+          <w:rStyle w:val="VerbatimChar"/>
+        </w:rPr>
+        <w:t xml:space="preserve">|                               |     | [!] Tenggat Pencacahan H-2           |</w:t>
+      </w:r>
+      <w:r>
+        <w:br/>
+      </w:r>
+      <w:r>
+        <w:rPr>
+          <w:rStyle w:val="VerbatimChar"/>
+        </w:rPr>
+        <w:t xml:space="preserve">|                               |     | [!] Pencacahan belum ada progres     |</w:t>
+      </w:r>
+      <w:r>
+        <w:br/>
+      </w:r>
+      <w:r>
+        <w:rPr>
+          <w:rStyle w:val="VerbatimChar"/>
+        </w:rPr>
+        <w:t xml:space="preserve">|                               |     | -- Menunggu persetujuan --           |</w:t>
+      </w:r>
+      <w:r>
+        <w:br/>
+      </w:r>
+      <w:r>
+        <w:rPr>
+          <w:rStyle w:val="VerbatimChar"/>
+        </w:rPr>
+        <w:t xml:space="preserve">|                               |     | [i] 4 dokumen menunggu persetujuan   |</w:t>
       </w:r>
       <w:r>
         <w:br/>
@@ -5344,43 +5651,122 @@
         <w:pStyle w:val="BodyText"/>
       </w:pPr>
       <w:r>
-        <w:t xml:space="preserve">Panel notifikasi muncul dari lonceng di bilah atas. Isinya berbeda menurut peran:</w:t>
-      </w:r>
-      <w:r>
-        <w:t xml:space="preserve"> </w:t>
-      </w:r>
-      <w:r>
-        <w:t xml:space="preserve">Ketua Tim menerima pemberitahuan tenggat tahap, dokumen yang ditolak, progres yang</w:t>
-      </w:r>
-      <w:r>
-        <w:t xml:space="preserve"> </w:t>
-      </w:r>
-      <w:r>
-        <w:t xml:space="preserve">tidak diperbarui, dan pengingat dari Tim Keuangan; Tim Keuangan menerima</w:t>
-      </w:r>
-      <w:r>
-        <w:t xml:space="preserve"> </w:t>
-      </w:r>
-      <w:r>
-        <w:t xml:space="preserve">pemberitahuan dokumen yang menunggu persetujuan, dokumen yang diunggah ulang,</w:t>
-      </w:r>
-      <w:r>
-        <w:t xml:space="preserve"> </w:t>
-      </w:r>
-      <w:r>
-        <w:t xml:space="preserve">dokumen yang menjadi tanggung jawabnya tetapi belum diisi, serta surat yang isinya</w:t>
-      </w:r>
-      <w:r>
-        <w:t xml:space="preserve"> </w:t>
-      </w:r>
-      <w:r>
-        <w:t xml:space="preserve">berubah setelah terbit. Notifikasi dirancang hilang dengan sendirinya setelah</w:t>
-      </w:r>
-      <w:r>
-        <w:t xml:space="preserve"> </w:t>
-      </w:r>
-      <w:r>
-        <w:t xml:space="preserve">penyebabnya diselesaikan, sehingga tidak ada daftar yang harus dibersihkan manual.</w:t>
+        <w:t xml:space="preserve">Panel notifikasi muncul dari lonceng di bilah atas, dan isinya</w:t>
+      </w:r>
+      <w:r>
+        <w:t xml:space="preserve"> </w:t>
+      </w:r>
+      <w:r>
+        <w:rPr>
+          <w:b/>
+          <w:bCs/>
+        </w:rPr>
+        <w:t xml:space="preserve">dikelompokkan</w:t>
+      </w:r>
+      <w:r>
+        <w:rPr>
+          <w:b/>
+          <w:bCs/>
+        </w:rPr>
+        <w:t xml:space="preserve"> </w:t>
+      </w:r>
+      <w:r>
+        <w:rPr>
+          <w:b/>
+          <w:bCs/>
+        </w:rPr>
+        <w:t xml:space="preserve">menurut tingkat kepentingan</w:t>
+      </w:r>
+      <w:r>
+        <w:t xml:space="preserve">, bukan ditampilkan sebagai satu daftar panjang:</w:t>
+      </w:r>
+      <w:r>
+        <w:t xml:space="preserve"> </w:t>
+      </w:r>
+      <w:r>
+        <w:t xml:space="preserve">perlu diperbaiki, tenggat mendekat, perlu diisi, menunggu persetujuan, dan</w:t>
+      </w:r>
+      <w:r>
+        <w:t xml:space="preserve"> </w:t>
+      </w:r>
+      <w:r>
+        <w:t xml:space="preserve">informasi. Pengelompokan ini dirancang agar hal yang mendesak tidak tenggelam di</w:t>
+      </w:r>
+      <w:r>
+        <w:t xml:space="preserve"> </w:t>
+      </w:r>
+      <w:r>
+        <w:t xml:space="preserve">antara pemberitahuan biasa.</w:t>
+      </w:r>
+    </w:p>
+    <w:p>
+      <w:pPr>
+        <w:pStyle w:val="BodyText"/>
+      </w:pPr>
+      <w:r>
+        <w:t xml:space="preserve">Isinya berbeda menurut peran. Ketua Tim menerima pemberitahuan tenggat tahap,</w:t>
+      </w:r>
+      <w:r>
+        <w:t xml:space="preserve"> </w:t>
+      </w:r>
+      <w:r>
+        <w:t xml:space="preserve">dokumen yang ditolak, progres yang tidak diperbarui, dan pengingat dari Tim</w:t>
+      </w:r>
+      <w:r>
+        <w:t xml:space="preserve"> </w:t>
+      </w:r>
+      <w:r>
+        <w:t xml:space="preserve">Keuangan. Tim Keuangan menerima pemberitahuan dokumen yang menunggu persetujuan,</w:t>
+      </w:r>
+      <w:r>
+        <w:t xml:space="preserve"> </w:t>
+      </w:r>
+      <w:r>
+        <w:t xml:space="preserve">dokumen yang diunggah ulang, dokumen yang menjadi tanggung jawabnya tetapi belum</w:t>
+      </w:r>
+      <w:r>
+        <w:t xml:space="preserve"> </w:t>
+      </w:r>
+      <w:r>
+        <w:t xml:space="preserve">diisi, serta surat yang isinya berubah setelah terbit. PML menerima peringatan</w:t>
+      </w:r>
+      <w:r>
+        <w:t xml:space="preserve"> </w:t>
+      </w:r>
+      <w:r>
+        <w:t xml:space="preserve">bila mitra yang diawasinya belum memiliki progres sama sekali sedangkan masa</w:t>
+      </w:r>
+      <w:r>
+        <w:t xml:space="preserve"> </w:t>
+      </w:r>
+      <w:r>
+        <w:t xml:space="preserve">pengumpulan data hampir berakhir — penerimanya ditentukan dari catatan PML pada</w:t>
+      </w:r>
+      <w:r>
+        <w:t xml:space="preserve"> </w:t>
+      </w:r>
+      <w:r>
+        <w:t xml:space="preserve">alokasi mitra, bukan dari peran akun, karena pegawai dengan peran apa pun dapat</w:t>
+      </w:r>
+      <w:r>
+        <w:t xml:space="preserve"> </w:t>
+      </w:r>
+      <w:r>
+        <w:t xml:space="preserve">ditugasi mengawasi mitra.</w:t>
+      </w:r>
+    </w:p>
+    <w:p>
+      <w:pPr>
+        <w:pStyle w:val="BodyText"/>
+      </w:pPr>
+      <w:r>
+        <w:t xml:space="preserve">Notifikasi dirancang hilang dengan sendirinya setelah penyebabnya diselesaikan,</w:t>
+      </w:r>
+      <w:r>
+        <w:t xml:space="preserve"> </w:t>
+      </w:r>
+      <w:r>
+        <w:t xml:space="preserve">sehingga tidak ada daftar yang harus dibersihkan manual.</w:t>
       </w:r>
     </w:p>
     <w:p>

</xml_diff>